<commit_message>
Corretti errori rendering, aggiunte funzioni recupero prompt
</commit_message>
<xml_diff>
--- a/verification_template.docx
+++ b/verification_template.docx
@@ -7,26 +7,44 @@
         <w:pStyle w:val="Corpotesto"/>
         <w:jc w:val="center"/>
         <w:rPr>
-          <w:rFonts w:ascii="Times New Roman" w:hAnsi="Times New Roman" w:cs="Times New Roman"/>
-          <w:b/>
-          <w:i/>
-          <w:sz w:val="26"/>
-          <w:szCs w:val="26"/>
+          <w:rFonts w:ascii="Bahnschrift SemiBold" w:hAnsi="Bahnschrift SemiBold" w:cs="Times New Roman"/>
+          <w:iCs/>
+          <w:sz w:val="32"/>
+          <w:szCs w:val="32"/>
         </w:rPr>
       </w:pPr>
       <w:r>
         <w:rPr>
-          <w:rFonts w:ascii="Times New Roman" w:hAnsi="Times New Roman" w:cs="Times New Roman"/>
-          <w:i/>
-          <w:sz w:val="26"/>
-          <w:szCs w:val="26"/>
+          <w:rFonts w:ascii="Bahnschrift SemiBold" w:hAnsi="Bahnschrift SemiBold" w:cs="Times New Roman"/>
+          <w:iCs/>
+          <w:sz w:val="32"/>
+          <w:szCs w:val="32"/>
         </w:rPr>
-        <w:t>Verifica sommativa classe ________</w:t>
+        <w:t xml:space="preserve">VERIFICA </w:t>
+      </w:r>
+      <w:r>
+        <w:rPr>
+          <w:rFonts w:ascii="Bahnschrift SemiBold" w:hAnsi="Bahnschrift SemiBold" w:cs="Times New Roman"/>
+          <w:iCs/>
+          <w:sz w:val="32"/>
+          <w:szCs w:val="32"/>
+        </w:rPr>
+        <w:t>SOMMATIVA</w:t>
+      </w:r>
+      <w:r>
+        <w:rPr>
+          <w:rFonts w:ascii="Bahnschrift SemiBold" w:hAnsi="Bahnschrift SemiBold" w:cs="Times New Roman"/>
+          <w:iCs/>
+          <w:sz w:val="32"/>
+          <w:szCs w:val="32"/>
+        </w:rPr>
+        <w:t xml:space="preserve"> DI MATEMATICA</w:t>
       </w:r>
     </w:p>
     <w:p>
       <w:pPr>
-        <w:pStyle w:val="Titolo1"/>
+        <w:pStyle w:val="Corpotesto"/>
+        <w:jc w:val="center"/>
         <w:rPr>
           <w:rFonts w:ascii="Times New Roman" w:hAnsi="Times New Roman" w:cs="Times New Roman"/>
           <w:i/>
@@ -34,10 +52,21 @@
           <w:szCs w:val="24"/>
         </w:rPr>
       </w:pPr>
+    </w:p>
+    <w:p>
+      <w:pPr>
+        <w:pStyle w:val="Corpotesto"/>
+        <w:rPr>
+          <w:rFonts w:ascii="Bahnschrift SemiBold" w:hAnsi="Bahnschrift SemiBold" w:cs="Times New Roman"/>
+          <w:iCs/>
+          <w:sz w:val="24"/>
+          <w:szCs w:val="24"/>
+        </w:rPr>
+      </w:pPr>
       <w:r>
         <w:rPr>
-          <w:rFonts w:ascii="Times New Roman" w:hAnsi="Times New Roman" w:cs="Times New Roman"/>
-          <w:i/>
+          <w:rFonts w:ascii="Bahnschrift SemiBold" w:hAnsi="Bahnschrift SemiBold" w:cs="Times New Roman"/>
+          <w:iCs/>
           <w:sz w:val="24"/>
           <w:szCs w:val="24"/>
         </w:rPr>
@@ -45,80 +74,82 @@
       </w:r>
       <w:r>
         <w:rPr>
-          <w:rFonts w:ascii="Times New Roman" w:hAnsi="Times New Roman" w:cs="Times New Roman"/>
-          <w:i/>
+          <w:rFonts w:ascii="Bahnschrift SemiBold" w:hAnsi="Bahnschrift SemiBold" w:cs="Times New Roman"/>
+          <w:iCs/>
           <w:sz w:val="24"/>
           <w:szCs w:val="24"/>
         </w:rPr>
-        <w:t>ognome e nome studente</w:t>
+        <w:t xml:space="preserve">ognome e nome </w:t>
+      </w:r>
+      <w:proofErr w:type="gramStart"/>
+      <w:r>
+        <w:rPr>
+          <w:rFonts w:ascii="Bahnschrift SemiBold" w:hAnsi="Bahnschrift SemiBold" w:cs="Times New Roman"/>
+          <w:iCs/>
+          <w:sz w:val="24"/>
+          <w:szCs w:val="24"/>
+        </w:rPr>
+        <w:t>studente</w:t>
       </w:r>
       <w:r>
         <w:rPr>
-          <w:rFonts w:ascii="Times New Roman" w:hAnsi="Times New Roman" w:cs="Times New Roman"/>
-          <w:i/>
+          <w:rFonts w:ascii="Bahnschrift SemiBold" w:hAnsi="Bahnschrift SemiBold" w:cs="Times New Roman"/>
+          <w:iCs/>
           <w:sz w:val="24"/>
           <w:szCs w:val="24"/>
         </w:rPr>
-        <w:t xml:space="preserve">: </w:t>
+        <w:t xml:space="preserve"> :</w:t>
+      </w:r>
+      <w:proofErr w:type="gramEnd"/>
+      <w:r>
+        <w:rPr>
+          <w:rFonts w:ascii="Bahnschrift SemiBold" w:hAnsi="Bahnschrift SemiBold" w:cs="Times New Roman"/>
+          <w:iCs/>
+          <w:sz w:val="24"/>
+          <w:szCs w:val="24"/>
+        </w:rPr>
+        <w:t xml:space="preserve"> _______________________________</w:t>
       </w:r>
       <w:r>
         <w:rPr>
-          <w:rFonts w:ascii="Times New Roman" w:hAnsi="Times New Roman" w:cs="Times New Roman"/>
-          <w:i/>
+          <w:rFonts w:ascii="Bahnschrift SemiBold" w:hAnsi="Bahnschrift SemiBold" w:cs="Times New Roman"/>
+          <w:iCs/>
           <w:sz w:val="24"/>
           <w:szCs w:val="24"/>
         </w:rPr>
-        <w:t xml:space="preserve">____________________  </w:t>
+        <w:t xml:space="preserve">  </w:t>
       </w:r>
       <w:r>
         <w:rPr>
-          <w:rFonts w:ascii="Times New Roman" w:hAnsi="Times New Roman" w:cs="Times New Roman"/>
-          <w:i/>
+          <w:rFonts w:ascii="Bahnschrift SemiBold" w:hAnsi="Bahnschrift SemiBold" w:cs="Times New Roman"/>
+          <w:iCs/>
           <w:sz w:val="24"/>
           <w:szCs w:val="24"/>
         </w:rPr>
-        <w:t xml:space="preserve">   </w:t>
+        <w:t xml:space="preserve">    </w:t>
       </w:r>
       <w:r>
         <w:rPr>
-          <w:rFonts w:ascii="Times New Roman" w:hAnsi="Times New Roman" w:cs="Times New Roman"/>
-          <w:i/>
+          <w:rFonts w:ascii="Bahnschrift SemiBold" w:hAnsi="Bahnschrift SemiBold" w:cs="Times New Roman"/>
+          <w:iCs/>
           <w:sz w:val="24"/>
           <w:szCs w:val="24"/>
         </w:rPr>
-        <w:tab/>
+        <w:t>Data:</w:t>
       </w:r>
       <w:r>
         <w:rPr>
-          <w:rFonts w:ascii="Times New Roman" w:hAnsi="Times New Roman" w:cs="Times New Roman"/>
-          <w:i/>
+          <w:rFonts w:ascii="Bahnschrift SemiBold" w:hAnsi="Bahnschrift SemiBold" w:cs="Times New Roman"/>
+          <w:iCs/>
           <w:sz w:val="24"/>
           <w:szCs w:val="24"/>
         </w:rPr>
-        <w:tab/>
+        <w:t xml:space="preserve"> ___</w:t>
       </w:r>
       <w:r>
         <w:rPr>
-          <w:rFonts w:ascii="Times New Roman" w:hAnsi="Times New Roman" w:cs="Times New Roman"/>
-          <w:i/>
-          <w:sz w:val="24"/>
-          <w:szCs w:val="24"/>
-        </w:rPr>
-        <w:t xml:space="preserve">     Vicenza,</w:t>
-      </w:r>
-      <w:r>
-        <w:rPr>
-          <w:rFonts w:ascii="Times New Roman" w:hAnsi="Times New Roman" w:cs="Times New Roman"/>
-          <w:i/>
-          <w:sz w:val="24"/>
-          <w:szCs w:val="24"/>
-        </w:rPr>
-        <w:t xml:space="preserve"> </w:t>
-      </w:r>
-      <w:r>
-        <w:rPr>
-          <w:rFonts w:ascii="Times New Roman" w:hAnsi="Times New Roman" w:cs="Times New Roman"/>
-          <w:i/>
+          <w:rFonts w:ascii="Bahnschrift SemiBold" w:hAnsi="Bahnschrift SemiBold" w:cs="Times New Roman"/>
+          <w:iCs/>
           <w:sz w:val="24"/>
           <w:szCs w:val="24"/>
         </w:rPr>
@@ -126,8 +157,8 @@
       </w:r>
       <w:r>
         <w:rPr>
-          <w:rFonts w:ascii="Times New Roman" w:hAnsi="Times New Roman" w:cs="Times New Roman"/>
-          <w:i/>
+          <w:rFonts w:ascii="Bahnschrift SemiBold" w:hAnsi="Bahnschrift SemiBold" w:cs="Times New Roman"/>
+          <w:iCs/>
           <w:sz w:val="24"/>
           <w:szCs w:val="24"/>
         </w:rPr>
@@ -135,8 +166,8 @@
       </w:r>
       <w:r>
         <w:rPr>
-          <w:rFonts w:ascii="Times New Roman" w:hAnsi="Times New Roman" w:cs="Times New Roman"/>
-          <w:i/>
+          <w:rFonts w:ascii="Bahnschrift SemiBold" w:hAnsi="Bahnschrift SemiBold" w:cs="Times New Roman"/>
+          <w:iCs/>
           <w:sz w:val="24"/>
           <w:szCs w:val="24"/>
         </w:rPr>
@@ -144,8 +175,8 @@
       </w:r>
       <w:r>
         <w:rPr>
-          <w:rFonts w:ascii="Times New Roman" w:hAnsi="Times New Roman" w:cs="Times New Roman"/>
-          <w:i/>
+          <w:rFonts w:ascii="Bahnschrift SemiBold" w:hAnsi="Bahnschrift SemiBold" w:cs="Times New Roman"/>
+          <w:iCs/>
           <w:sz w:val="24"/>
           <w:szCs w:val="24"/>
         </w:rPr>
@@ -5486,7 +5517,7 @@
     <w:sectPr>
       <w:headerReference w:type="default" r:id="rId7"/>
       <w:pgSz w:w="11906" w:h="16838"/>
-      <w:pgMar w:top="568" w:right="1134" w:bottom="568" w:left="1134" w:header="708" w:footer="708" w:gutter="0"/>
+      <w:pgMar w:top="568" w:right="1134" w:bottom="568" w:left="1134" w:header="284" w:footer="708" w:gutter="0"/>
       <w:cols w:space="708"/>
       <w:docGrid w:linePitch="360"/>
     </w:sectPr>
@@ -5536,80 +5567,6 @@
 <w:hdr xmlns:wpc="http://schemas.microsoft.com/office/word/2010/wordprocessingCanvas" xmlns:cx="http://schemas.microsoft.com/office/drawing/2014/chartex" xmlns:cx1="http://schemas.microsoft.com/office/drawing/2015/9/8/chartex" xmlns:cx2="http://schemas.microsoft.com/office/drawing/2015/10/21/chartex" xmlns:cx3="http://schemas.microsoft.com/office/drawing/2016/5/9/chartex" xmlns:cx4="http://schemas.microsoft.com/office/drawing/2016/5/10/chartex" xmlns:cx5="http://schemas.microsoft.com/office/drawing/2016/5/11/chartex" xmlns:cx6="http://schemas.microsoft.com/office/drawing/2016/5/12/chartex" xmlns:cx7="http://schemas.microsoft.com/office/drawing/2016/5/13/chartex" xmlns:cx8="http://schemas.microsoft.com/office/drawing/2016/5/14/chartex" xmlns:mc="http://schemas.openxmlformats.org/markup-compatibility/2006" xmlns:aink="http://schemas.microsoft.com/office/drawing/2016/ink" xmlns:am3d="http://schemas.microsoft.com/office/drawing/2017/model3d" xmlns:o="urn:schemas-microsoft-com:office:office" xmlns:oel="http://schemas.microsoft.com/office/2019/extlst" xmlns:r="http://schemas.openxmlformats.org/officeDocument/2006/relationships" xmlns:m="http://schemas.openxmlformats.org/officeDocument/2006/math" xmlns:v="urn:schemas-microsoft-com:vml" xmlns:wp14="http://schemas.microsoft.com/office/word/2010/wordprocessingDrawing" xmlns:wp="http://schemas.openxmlformats.org/drawingml/2006/wordprocessingDrawing" xmlns:w10="urn:schemas-microsoft-com:office:word" xmlns:w="http://schemas.openxmlformats.org/wordprocessingml/2006/main" xmlns:w14="http://schemas.microsoft.com/office/word/2010/wordml" xmlns:w15="http://schemas.microsoft.com/office/word/2012/wordml" xmlns:w16cex="http://schemas.microsoft.com/office/word/2018/wordml/cex" xmlns:w16cid="http://schemas.microsoft.com/office/word/2016/wordml/cid" xmlns:w16="http://schemas.microsoft.com/office/word/2018/wordml" xmlns:w16du="http://schemas.microsoft.com/office/word/2023/wordml/word16du" xmlns:w16sdtdh="http://schemas.microsoft.com/office/word/2020/wordml/sdtdatahash" xmlns:w16sdtfl="http://schemas.microsoft.com/office/word/2024/wordml/sdtformatlock" xmlns:w16se="http://schemas.microsoft.com/office/word/2015/wordml/symex" xmlns:wpg="http://schemas.microsoft.com/office/word/2010/wordprocessingGroup" xmlns:wpi="http://schemas.microsoft.com/office/word/2010/wordprocessingInk" xmlns:wne="http://schemas.microsoft.com/office/word/2006/wordml" xmlns:wps="http://schemas.microsoft.com/office/word/2010/wordprocessingShape" mc:Ignorable="w14 w15 w16se w16cid w16 w16cex w16sdtdh w16sdtfl w16du wp14">
   <w:p>
     <w:pPr>
-      <w:pStyle w:val="Intestazione"/>
-    </w:pPr>
-    <w:r>
-      <w:rPr>
-        <w:noProof/>
-      </w:rPr>
-      <w:drawing>
-        <wp:anchor distT="0" distB="0" distL="114935" distR="114935" simplePos="0" relativeHeight="251659264" behindDoc="0" locked="0" layoutInCell="1" allowOverlap="1" wp14:anchorId="5FB20693" wp14:editId="55B59D65">
-          <wp:simplePos x="0" y="0"/>
-          <wp:positionH relativeFrom="margin">
-            <wp:posOffset>2754630</wp:posOffset>
-          </wp:positionH>
-          <wp:positionV relativeFrom="paragraph">
-            <wp:posOffset>-220980</wp:posOffset>
-          </wp:positionV>
-          <wp:extent cx="441960" cy="496631"/>
-          <wp:effectExtent l="0" t="0" r="0" b="0"/>
-          <wp:wrapNone/>
-          <wp:docPr id="824480107" name="Immagine 2" descr="Immagine che contiene testo, origami&#10;&#10;Il contenuto generato dall'IA potrebbe non essere corretto."/>
-          <wp:cNvGraphicFramePr>
-            <a:graphicFrameLocks xmlns:a="http://schemas.openxmlformats.org/drawingml/2006/main" noChangeAspect="1"/>
-          </wp:cNvGraphicFramePr>
-          <a:graphic xmlns:a="http://schemas.openxmlformats.org/drawingml/2006/main">
-            <a:graphicData uri="http://schemas.openxmlformats.org/drawingml/2006/picture">
-              <pic:pic xmlns:pic="http://schemas.openxmlformats.org/drawingml/2006/picture">
-                <pic:nvPicPr>
-                  <pic:cNvPr id="1059429156" name="Immagine 2" descr="Immagine che contiene testo, origami&#10;&#10;Il contenuto generato dall'IA potrebbe non essere corretto."/>
-                  <pic:cNvPicPr>
-                    <a:picLocks noChangeAspect="1" noChangeArrowheads="1"/>
-                  </pic:cNvPicPr>
-                </pic:nvPicPr>
-                <pic:blipFill>
-                  <a:blip r:embed="rId1">
-                    <a:extLst>
-                      <a:ext uri="{28A0092B-C50C-407E-A947-70E740481C1C}">
-                        <a14:useLocalDpi xmlns:a14="http://schemas.microsoft.com/office/drawing/2010/main" val="0"/>
-                      </a:ext>
-                    </a:extLst>
-                  </a:blip>
-                  <a:srcRect/>
-                  <a:stretch>
-                    <a:fillRect/>
-                  </a:stretch>
-                </pic:blipFill>
-                <pic:spPr bwMode="auto">
-                  <a:xfrm>
-                    <a:off x="0" y="0"/>
-                    <a:ext cx="447767" cy="503156"/>
-                  </a:xfrm>
-                  <a:prstGeom prst="rect">
-                    <a:avLst/>
-                  </a:prstGeom>
-                  <a:solidFill>
-                    <a:srgbClr val="FFFFFF"/>
-                  </a:solidFill>
-                  <a:ln>
-                    <a:noFill/>
-                  </a:ln>
-                </pic:spPr>
-              </pic:pic>
-            </a:graphicData>
-          </a:graphic>
-          <wp14:sizeRelH relativeFrom="page">
-            <wp14:pctWidth>0</wp14:pctWidth>
-          </wp14:sizeRelH>
-          <wp14:sizeRelV relativeFrom="page">
-            <wp14:pctHeight>0</wp14:pctHeight>
-          </wp14:sizeRelV>
-        </wp:anchor>
-      </w:drawing>
-    </w:r>
-  </w:p>
-  <w:p>
-    <w:pPr>
       <w:jc w:val="center"/>
       <w:rPr>
         <w:b/>
@@ -5621,82 +5578,6 @@
   </w:p>
   <w:p>
     <w:pPr>
-      <w:jc w:val="center"/>
-      <w:rPr>
-        <w:b/>
-        <w:bCs/>
-        <w:i/>
-        <w:iCs/>
-        <w:sz w:val="20"/>
-        <w:szCs w:val="20"/>
-      </w:rPr>
-    </w:pPr>
-    <w:r>
-      <w:rPr>
-        <w:b/>
-        <w:bCs/>
-        <w:sz w:val="20"/>
-        <w:szCs w:val="20"/>
-      </w:rPr>
-      <w:t xml:space="preserve">ISTITUTO </w:t>
-    </w:r>
-    <w:r>
-      <w:rPr>
-        <w:b/>
-        <w:bCs/>
-        <w:sz w:val="20"/>
-        <w:szCs w:val="20"/>
-      </w:rPr>
-      <w:t xml:space="preserve">ISTRUZIONE SUPERIORE </w:t>
-    </w:r>
-  </w:p>
-  <w:p>
-    <w:pPr>
-      <w:jc w:val="center"/>
-      <w:rPr>
-        <w:b/>
-        <w:bCs/>
-        <w:sz w:val="20"/>
-        <w:szCs w:val="20"/>
-      </w:rPr>
-    </w:pPr>
-    <w:r>
-      <w:rPr>
-        <w:b/>
-        <w:bCs/>
-        <w:i/>
-        <w:iCs/>
-        <w:sz w:val="20"/>
-        <w:szCs w:val="20"/>
-      </w:rPr>
-      <w:t>"</w:t>
-    </w:r>
-    <w:r>
-      <w:rPr>
-        <w:b/>
-        <w:bCs/>
-        <w:i/>
-        <w:iCs/>
-        <w:sz w:val="20"/>
-        <w:szCs w:val="20"/>
-      </w:rPr>
-      <w:t>ANDREA SCOTTON</w:t>
-    </w:r>
-    <w:r>
-      <w:rPr>
-        <w:b/>
-        <w:bCs/>
-        <w:i/>
-        <w:iCs/>
-        <w:sz w:val="20"/>
-        <w:szCs w:val="20"/>
-      </w:rPr>
-      <w:t>"</w:t>
-    </w:r>
-  </w:p>
-  <w:p>
-    <w:pPr>
-      <w:jc w:val="center"/>
       <w:rPr>
         <w:b/>
         <w:bCs/>
@@ -5711,34 +5592,41 @@
         <w:sz w:val="20"/>
         <w:szCs w:val="20"/>
       </w:rPr>
-      <w:t>V</w:t>
-    </w:r>
-    <w:r>
-      <w:rPr>
-        <w:b/>
-        <w:bCs/>
-        <w:sz w:val="20"/>
-        <w:szCs w:val="20"/>
-      </w:rPr>
-      <w:t>IA ROMA,56 36042</w:t>
-    </w:r>
-    <w:r>
-      <w:rPr>
-        <w:b/>
-        <w:bCs/>
-        <w:sz w:val="20"/>
-        <w:szCs w:val="20"/>
-      </w:rPr>
-      <w:t xml:space="preserve"> </w:t>
-    </w:r>
-    <w:r>
-      <w:rPr>
-        <w:b/>
-        <w:bCs/>
-        <w:sz w:val="20"/>
-        <w:szCs w:val="20"/>
-      </w:rPr>
-      <w:t>BREGANZE (VI)</w:t>
+      <w:drawing>
+        <wp:inline distT="0" distB="0" distL="0" distR="0" wp14:anchorId="2CCB83B8" wp14:editId="7FF1A2DB">
+          <wp:extent cx="2990850" cy="909219"/>
+          <wp:effectExtent l="0" t="0" r="0" b="5715"/>
+          <wp:docPr id="336794015" name="Immagine 1"/>
+          <wp:cNvGraphicFramePr>
+            <a:graphicFrameLocks xmlns:a="http://schemas.openxmlformats.org/drawingml/2006/main" noChangeAspect="1"/>
+          </wp:cNvGraphicFramePr>
+          <a:graphic xmlns:a="http://schemas.openxmlformats.org/drawingml/2006/main">
+            <a:graphicData uri="http://schemas.openxmlformats.org/drawingml/2006/picture">
+              <pic:pic xmlns:pic="http://schemas.openxmlformats.org/drawingml/2006/picture">
+                <pic:nvPicPr>
+                  <pic:cNvPr id="1968683946" name=""/>
+                  <pic:cNvPicPr/>
+                </pic:nvPicPr>
+                <pic:blipFill>
+                  <a:blip r:embed="rId1"/>
+                  <a:stretch>
+                    <a:fillRect/>
+                  </a:stretch>
+                </pic:blipFill>
+                <pic:spPr>
+                  <a:xfrm>
+                    <a:off x="0" y="0"/>
+                    <a:ext cx="3006280" cy="913910"/>
+                  </a:xfrm>
+                  <a:prstGeom prst="rect">
+                    <a:avLst/>
+                  </a:prstGeom>
+                </pic:spPr>
+              </pic:pic>
+            </a:graphicData>
+          </a:graphic>
+        </wp:inline>
+      </w:drawing>
     </w:r>
   </w:p>
   <w:p>
@@ -6772,6 +6660,7 @@
   <w:style w:type="character" w:default="1" w:styleId="Carpredefinitoparagrafo">
     <w:name w:val="Default Paragraph Font"/>
     <w:uiPriority w:val="1"/>
+    <w:semiHidden/>
     <w:unhideWhenUsed/>
   </w:style>
   <w:style w:type="table" w:default="1" w:styleId="Tabellanormale">

</xml_diff>